<commit_message>
ADR 0011 amendment and documents for the S1 entry conditions
- ADR 0011: the three items due before S1 are done (DR-16, DR-25, DR-30).
- Register and review file: those findings are applied.
- Specification 10: alert recipients in ExpiryAlertRuleRole, the company tax numbers read from the
  mirror's tax identity. DOC-B05, DOC-B06, DOC-F02 (DQ-F02-8 implemented, the flow gap closed) and DOC-S06
  follow.

Co-Authored-By: Claude Opus 5.5 <noreply@anthropic.com>
Claude-Session: https://claude.ai/code/session_012HHcRrzuvMBTL2FYxXtsyv
</commit_message>
<xml_diff>
--- a/treasury-platform/docs/32-REVIEW-FINDINGS-DECISIONS.docx
+++ b/treasury-platform/docs/32-REVIEW-FINDINGS-DECISIONS.docx
@@ -611,7 +611,7 @@
                 <w:szCs w:val="18"/>
                 <w:rtl/>
               </w:rPr>
-              <w:t xml:space="preserve"> الدفعة (أ) منفّذة وتمر في CI، والدفعة (ب) شروط دخول لشرائحها</w:t>
+              <w:t xml:space="preserve"> الدفعة (أ) منفّذة وتمر في CI، وبنود ما قبل S1 من الدفعة (ب) منفّذة أيضًا، والباقي شروط دخول لشرائحه</w:t>
             </w:r>
           </w:p>
         </w:tc>
@@ -19209,14 +19209,45 @@
             </w:pPr>
             <w:r>
               <w:rPr>
-                <w:rFonts w:ascii="Arial" w:cs="Arial" w:eastAsia="Arial" w:hAnsi="Arial"/>
-                <w:b w:val="false"/>
-                <w:bCs w:val="false"/>
-                <w:sz w:val="18"/>
-                <w:szCs w:val="18"/>
-                <w:rtl/>
-              </w:rPr>
-              <w:t xml:space="preserve">DR-16 جدول وصل لأدوار مستلمي التنبيه؛ DR-25 حذف </w:t>
+                <w:rFonts w:ascii="Segoe UI Emoji" w:cs="Segoe UI Emoji" w:eastAsia="Segoe UI Emoji" w:hAnsi="Segoe UI Emoji"/>
+                <w:sz w:val="18"/>
+                <w:szCs w:val="18"/>
+                <w:rtl/>
+              </w:rPr>
+              <w:t xml:space="preserve">✅</w:t>
+            </w:r>
+            <w:r>
+              <w:rPr>
+                <w:rFonts w:ascii="Arial" w:cs="Arial" w:eastAsia="Arial" w:hAnsi="Arial"/>
+                <w:b w:val="false"/>
+                <w:bCs w:val="false"/>
+                <w:sz w:val="18"/>
+                <w:szCs w:val="18"/>
+                <w:rtl/>
+              </w:rPr>
+              <w:t xml:space="preserve"> </w:t>
+            </w:r>
+            <w:r>
+              <w:rPr>
+                <w:rFonts w:ascii="Arial" w:cs="Arial" w:eastAsia="Arial" w:hAnsi="Arial"/>
+                <w:b/>
+                <w:bCs/>
+                <w:sz w:val="18"/>
+                <w:szCs w:val="18"/>
+                <w:rtl/>
+              </w:rPr>
+              <w:t xml:space="preserve">منفّذة 2026-10-13</w:t>
+            </w:r>
+            <w:r>
+              <w:rPr>
+                <w:rFonts w:ascii="Arial" w:cs="Arial" w:eastAsia="Arial" w:hAnsi="Arial"/>
+                <w:b w:val="false"/>
+                <w:bCs w:val="false"/>
+                <w:sz w:val="18"/>
+                <w:szCs w:val="18"/>
+                <w:rtl/>
+              </w:rPr>
+              <w:t xml:space="preserve"> (الاختبارات RF19 إلى RF21): DR-16 جدول وصل لأدوار مستلمي التنبيه؛ DR-25 حذف </w:t>
             </w:r>
             <w:r>
               <w:rPr>

</xml_diff>